<commit_message>
PeerJ compliance fixes: citation order, units, AI disclosure, heading styles
</commit_message>
<xml_diff>
--- a/peerj_submission/main_manuscript.docx
+++ b/peerj_submission/main_manuscript.docx
@@ -304,7 +304,7 @@
         <w:jc w:val="left"/>
       </w:pPr>
       <w:r>
-        <w:t>Main text (Introduction through Conclusions): approximately 5,600 words</w:t>
+        <w:t>Main text (Introduction through Conclusions): approximately 5,900 words</w:t>
       </w:r>
     </w:p>
     <w:p>
@@ -314,7 +314,7 @@
         <w:jc w:val="left"/>
       </w:pPr>
       <w:r>
-        <w:t>Abstract: 337 words (2,478 characters)</w:t>
+        <w:t>Abstract: 337 words (2,497 characters)</w:t>
       </w:r>
     </w:p>
     <w:p>
@@ -375,6 +375,7 @@
     </w:p>
     <w:p>
       <w:pPr>
+        <w:pStyle w:val="Heading1"/>
         <w:keepNext/>
         <w:spacing w:before="0" w:after="360"/>
         <w:jc w:val="left"/>
@@ -390,6 +391,7 @@
     </w:p>
     <w:p>
       <w:pPr>
+        <w:pStyle w:val="Heading2"/>
         <w:keepNext/>
         <w:spacing w:before="360" w:after="120"/>
         <w:jc w:val="left"/>
@@ -428,7 +430,7 @@
         <w:t>Methods.</w:t>
       </w:r>
       <w:r>
-        <w:t xml:space="preserve"> We built a locked validation atlas of 4,608 paired trials per controller: three validation seeds x four model families x 32 uncertainty draws x 12 delay/noise scenarios, forming 384 clusters of 12 trials. A logistic scoring rule, fitted on independent seeds and applied unchanged, assigned every trial to a predicted-baseline-success band from pre-treatment quantities only. Each controller was compared with delayed full feedback using 95% cluster-bootstrap intervals (10,000 replicates), cluster-level sign-flip permutation tests (20,000 permutations), Holm correction over the 12 controller x band tests, and minimum detectable effects at 80% power. We added a 16-specification curve per controller, Pareto dominance analysis, and a Dirichlet weight-sensitivity analysis.</w:t>
+        <w:t xml:space="preserve"> We built a locked validation atlas of 4,608 paired trials per controller: three validation seeds × four model families × 32 uncertainty draws × 12 delay/noise scenarios, forming 384 clusters of 12 trials. A logistic scoring rule, fitted on independent seeds and applied unchanged, assigned every trial to a predicted-baseline-success band from pre-treatment quantities only. Each controller was compared with delayed full feedback using 95% cluster-bootstrap intervals (10,000 replicates), cluster-level sign-flip permutation tests (20,000 permutations), Holm correction over the 12 controller × band tests, and minimum detectable effects at 80% power. We added a 16-specification curve per controller, Pareto dominance analysis, and a Dirichlet weight-sensitivity analysis.</w:t>
       </w:r>
     </w:p>
     <w:p>
@@ -461,6 +463,7 @@
     </w:p>
     <w:p>
       <w:pPr>
+        <w:pStyle w:val="Heading2"/>
         <w:keepNext/>
         <w:spacing w:before="360" w:after="120"/>
         <w:jc w:val="left"/>
@@ -520,7 +523,7 @@
         <w:jc w:val="left"/>
       </w:pPr>
       <w:r>
-        <w:t>We therefore asked a deliberately adversarial question. Given a locked validation atlas, a frozen scoring rule, paired trials, cluster-robust inference, multiplicity control, a specification curve, and a Pareto analysis, does any of four delayed-feedback controllers for coupled photothermal-photodynamic simulation remain superior to delayed full feedback? The protocol was designed so that a negative answer would be informative: the question was whether any controller would show a positive overall effect with a confidence interval excluding zero. None did.</w:t>
+        <w:t>We therefore asked a deliberately adversarial question. Given a locked validation atlas, a frozen scoring rule, paired trials, cluster-robust inference, multiplicity control, a specification curve, and a Pareto analysis, does any of four delayed-feedback controllers for coupled photothermal-photodynamic simulation remain superior to delayed full feedback? The protocol was designed so that a negative answer would be informative: the question was whether any controller would show a positive overall effect with a confidence interval excluding zero. None did. The three-stage protocol is summarised in Fig. 1.</w:t>
       </w:r>
     </w:p>
     <w:p>
@@ -528,11 +531,12 @@
         <w:jc w:val="left"/>
       </w:pPr>
       <w:r>
-        <w:t>The contribution is fourfold. First, we specify a locked paired-validation protocol for closed-loop therapy software, in which endpoint thresholds, the stratification rule and the estimator are fixed in version-controlled code and applied identically to every controller and every validation seed. Second, we provide a cluster-robust inference pipeline that reports effect sizes, 95% intervals, exact permutation p-values, Holm-adjusted p-values and minimum detectable effects for every controller x endpoint x stratum cell. Third, we add a specification curve that quantifies how far the headline conclusion moves across defensible analysis choices, and a Pareto and weight-sensitivity analysis that replaces an arbitrary scalar utility with an explicit statement about preference dependence. Fourth, we apply the protocol to a 4,608-trial-per-controller atlas and report the result, which is that no controller dominates and that the apparent advantage in the predicted-low band does not survive correction.</w:t>
+        <w:t>The contribution is fourfold. First, we specify a locked paired-validation protocol for closed-loop therapy software, in which endpoint thresholds, the stratification rule and the estimator are fixed in version-controlled code and applied identically to every controller and every validation seed. Second, we provide a cluster-robust inference pipeline that reports effect sizes, 95% intervals, exact permutation p-values, Holm-adjusted p-values and minimum detectable effects for every controller × endpoint × stratum cell. Third, we add a specification curve that quantifies how far the headline conclusion moves across defensible analysis choices, and a Pareto and weight-sensitivity analysis that replaces an arbitrary scalar utility with an explicit statement about preference dependence. Fourth, we apply the protocol to a 4,608-trial-per-controller atlas and report the result, which is that no controller dominates and that the apparent advantage in the predicted-low band does not survive correction.</w:t>
       </w:r>
     </w:p>
     <w:p>
       <w:pPr>
+        <w:pStyle w:val="Heading2"/>
         <w:keepNext/>
         <w:spacing w:before="360" w:after="120"/>
         <w:jc w:val="left"/>
@@ -543,11 +547,12 @@
           <w:b/>
           <w:sz w:val="24"/>
         </w:rPr>
-        <w:t>Materials and methods</w:t>
+        <w:t>Materials &amp; Methods</w:t>
       </w:r>
     </w:p>
     <w:p>
       <w:pPr>
+        <w:pStyle w:val="Heading3"/>
         <w:keepNext/>
         <w:spacing w:before="240" w:after="80"/>
         <w:jc w:val="left"/>
@@ -567,7 +572,7 @@
         <w:jc w:val="left"/>
       </w:pPr>
       <w:r>
-        <w:t>The case study is a one-dimensional radial model of a vascularised tumour spheroid, implemented in Python and used throughout as a fixed computational testbed rather than as a clinical predictor. The spheroid has a radius of 500 um discretised on 96 radial nodes. Temperature is advanced with the Pennes bioheat equation using backward Euler time integration and a tridiagonal solve, with tissue density 1060 kg m^-3, specific heat 3600 J kg^-1 K^-1, thermal conductivity 0.50 W m^-1 K^-1, and perfusion represented as a volumetric heat sink proportional to the local blood-flow parameter. The photothermal source is the product of a gold-nanorod absorption cross-section computed with Gans theory, a radial nanoparticle distribution with a 0.30 surface bias, and a radial optical fluence profile; nanorod length spans 40-100 nm and width 10-30 nm, and the medium refractive index is 1.33. A magnetic loss term is included so that the same testbed can represent magneto-plasmonic heating.</w:t>
+        <w:t>The case study is a one-dimensional radial model of a vascularised tumour spheroid, implemented in Python and used throughout as a fixed computational testbed rather than as a clinical predictor. The spheroid has a radius of 500 µm discretised on 96 radial nodes. Temperature is advanced with the Pennes bioheat equation using backward Euler time integration and a tridiagonal solve, with tissue density 1060 kg m⁻³, specific heat 3600 J kg⁻¹ K⁻¹, thermal conductivity 0.50 W m⁻¹ K⁻¹, and perfusion represented as a volumetric heat sink proportional to the local blood-flow parameter. The photothermal source is the product of a gold-nanorod absorption cross-section computed with Gans theory, a radial nanoparticle distribution with a 0.30 surface bias, and a radial optical fluence profile; nanorod length spans 40-100 nm and width 10-30 nm, and the medium refractive index is 1.33. A magnetic loss term is included so that the same testbed can represent magneto-plasmonic heating.</w:t>
       </w:r>
     </w:p>
     <w:p>
@@ -575,7 +580,7 @@
         <w:jc w:val="left"/>
       </w:pPr>
       <w:r>
-        <w:t>ROS generation is integrated on a 0.5 s substep inside each 10 s control interval. Singlet-oxygen dose accumulates only while the light is on, with a generation rate proportional to fluence, local photosensitiser concentration and an oxygen-saturation factor; photosensitiser is bleached at a rate that weakens at low concentration, and oxygen is replenished towards an initial 40 uM with a radial gradient. The singlet-oxygen threshold is 0.67 mM. The protocol window is 300 s of light-on time; duty cycle extends the wall-clock duration without changing the light-on dose.</w:t>
+        <w:t>ROS generation is integrated on a 0.5 s substep inside each 10 s control interval. Singlet-oxygen dose accumulates only while the light is on, with a generation rate proportional to fluence, local photosensitiser concentration and an oxygen-saturation factor; photosensitiser is bleached at a rate that weakens at low concentration, and oxygen is replenished towards an initial 40 µM with a radial gradient. The singlet-oxygen threshold is 0.67 mM. The protocol window is 300 s of light-on time; duty cycle extends the wall-clock duration without changing the light-on dose.</w:t>
       </w:r>
     </w:p>
     <w:p>
@@ -588,6 +593,7 @@
     </w:p>
     <w:p>
       <w:pPr>
+        <w:pStyle w:val="Heading3"/>
         <w:keepNext/>
         <w:spacing w:before="240" w:after="80"/>
         <w:jc w:val="left"/>
@@ -607,7 +613,7 @@
         <w:jc w:val="left"/>
       </w:pPr>
       <w:r>
-        <w:t>Five decision rules were compared. All share the same maximum intensity of 1.30 W cm^-2 and the same 10 s control interval.</w:t>
+        <w:t>Five decision rules were compared. All share the same maximum intensity of 1.30 W cm⁻² and the same 10 s control interval.</w:t>
       </w:r>
     </w:p>
     <w:p>
@@ -635,7 +641,7 @@
         <w:t>Smoothed predictive</w:t>
       </w:r>
       <w:r>
-        <w:t xml:space="preserve"> estimates the current state with a six-sample sliding window, applies a prediction gain of 0.85, and enforces a 0.35 C thermal margin. It adds delay-dependent safety rules: at 60 s or more of delay it stops above 51.5 C unless ROS coverage is already at 0.80, and at 120 s or more it stops above 51.0 C unless ROS coverage is already at 0.75.</w:t>
+        <w:t xml:space="preserve"> estimates the current state with a six-sample sliding window, applies a prediction gain of 0.85, and enforces a 0.35 °C thermal margin. It adds delay-dependent safety rules: at 60 s or more of delay it stops above 51.5 °C unless ROS coverage is already at 0.80, and at 120 s or more it stops above 51.0 °C unless ROS coverage is already at 0.75.</w:t>
       </w:r>
     </w:p>
     <w:p>
@@ -649,7 +655,7 @@
         <w:t>Thermal-floor predictive</w:t>
       </w:r>
       <w:r>
-        <w:t xml:space="preserve"> uses the same estimator and adds a thermal floor. If the warm fraction is below 0.48 and the maximum temperature is below 48.6 C, it applies a floor intensity of 0.58 times the maximum, scaled down when oxygen is limiting. Once ROS coverage reaches 0.82 and the warm fraction target is met, it drops to a 0.22 W cm^-2 maintenance intensity or stops.</w:t>
+        <w:t xml:space="preserve"> uses the same estimator and adds a thermal floor. If the warm fraction is below 0.48 and the maximum temperature is below 48.6 °C, it applies a floor intensity of 0.58 times the maximum, scaled down when oxygen is limiting. Once ROS coverage reaches 0.82 and the warm fraction target is met, it drops to a 0.22 W cm⁻² maintenance intensity or stops.</w:t>
       </w:r>
     </w:p>
     <w:p>
@@ -663,7 +669,7 @@
         <w:t>Constrained optimized</w:t>
       </w:r>
       <w:r>
-        <w:t xml:space="preserve"> is a re-parameterisation of the thermal-floor architecture, selected by a chance-constrained random search over 20 candidates on two independent training seeds (20260730 and 20260731) with eight draws each, then validated without further tuning on the three validation seeds. Its selected parameters are a maximum intensity of 1.128 W cm^-2, prediction gain 0.669, thermal margin 0.550 C, thermal-floor warm fraction 0.478, thermal-floor temperature 48.52 C, floor fraction 0.437, maintenance intensity 0.212 W cm^-2, long-delay safety temperature 50.64 C, and mid-delay safety temperature 51.09 C.</w:t>
+        <w:t xml:space="preserve"> is a re-parameterisation of the thermal-floor architecture, selected by a chance-constrained random search over 20 candidates on two independent training seeds (20260730 and 20260731) with eight draws each, then validated without further tuning on the three validation seeds. Its selected parameters are a maximum intensity of 1.128 W cm⁻², prediction gain 0.669, thermal margin 0.550 °C, thermal-floor warm fraction 0.478, thermal-floor temperature 48.52 °C, floor fraction 0.437, maintenance intensity 0.212 W cm⁻², long-delay safety temperature 50.64 °C, and mid-delay safety temperature 51.09 °C.</w:t>
       </w:r>
     </w:p>
     <w:p>
@@ -677,11 +683,12 @@
         <w:t>Reduced-order MPC</w:t>
       </w:r>
       <w:r>
-        <w:t xml:space="preserve"> is a receding-horizon benchmark. At each control step it propagates a four-state reduced model (temperature, warm fraction, ROS coverage, mean oxygen) four steps ahead over an eight-point intensity grid, discounts by 0.88 per step, and minimises a stage cost with weights 0.045 on energy, 4.8 on overheating, 0.9 on oxygen depletion, 1.8 on thermal deviation and 1.2 on ROS shortfall. It hard-stops above 52.2 C unless ROS coverage is already at 0.78, and stops when oxygen falls below 8.0 uM with ROS coverage below 0.82.</w:t>
+        <w:t xml:space="preserve"> is a receding-horizon benchmark. At each control step it propagates a four-state reduced model (temperature, warm fraction, ROS coverage, mean oxygen) four steps ahead over an eight-point intensity grid, discounts by 0.88 per step, and minimises a stage cost with weights 0.045 on energy, 4.8 on overheating, 0.9 on oxygen depletion, 1.8 on thermal deviation and 1.2 on ROS shortfall. It hard-stops above 52.2 °C unless ROS coverage is already at 0.78, and stops when oxygen falls below 8.0 µM with ROS coverage below 0.82.</w:t>
       </w:r>
     </w:p>
     <w:p>
       <w:pPr>
+        <w:pStyle w:val="Heading3"/>
         <w:keepNext/>
         <w:spacing w:before="240" w:after="80"/>
         <w:jc w:val="left"/>
@@ -701,7 +708,7 @@
         <w:jc w:val="left"/>
       </w:pPr>
       <w:r>
-        <w:t>The atlas crosses three validation seeds (20260720, 20260721, 20260722), four model families (baseline, large geometry, low photosensitiser, slow recovery), 32 uncertainty draws per seed and family sampled by Latin hypercube, and 12 sensing scenarios formed by the product of six delays (0, 30, 60, 90, 120 and 180 s) and two noise levels (0% and 10%). Each controller therefore contributes 3 x 4 x 32 x 12 = 4,608 trials, and each baseline-controller comparison is paired on seed, family, draw, delay and noise. The 384 seed x family x draw combinations define the clusters used for inference, with exactly 12 paired trials per cluster.</w:t>
+        <w:t>The atlas crosses three validation seeds (20260720, 20260721, 20260722), four model families (baseline, large geometry, low photosensitiser, slow recovery), 32 uncertainty draws per seed and family sampled by Latin hypercube, and 12 sensing scenarios formed by the product of six delays (0, 30, 60, 90, 120 and 180 s) and two noise levels (0% and 10%). Each controller therefore contributes 3 × 4 × 32 × 12 = 4,608 trials, and each baseline-controller comparison is paired on seed, family, draw, delay and noise. The 384 seed × family × draw combinations define the clusters used for inference, with exactly 12 paired trials per cluster.</w:t>
       </w:r>
     </w:p>
     <w:p>
@@ -714,6 +721,7 @@
     </w:p>
     <w:p>
       <w:pPr>
+        <w:pStyle w:val="Heading3"/>
         <w:keepNext/>
         <w:spacing w:before="240" w:after="80"/>
         <w:jc w:val="left"/>
@@ -766,11 +774,12 @@
         <w:t>predicted-baseline-success band</w:t>
       </w:r>
       <w:r>
-        <w:t xml:space="preserve"> deliberately. The score predicts how likely the baseline controller is to succeed, not how controllable a case is. Discrimination is modest: the area under the receiver-operating characteristic curve is 0.688 overall in the validation atlas, ranges from 0.590 to 0.727 across seed x family cells, and is 0.610 with a Brier score of 0.265 on a fully held-out seed that was used neither for fitting nor for tuning. A score with this discrimination supports a stratified description but not a claim that the bands identify a latent controllability construct, and we make only the weaker claim.</w:t>
+        <w:t xml:space="preserve"> deliberately. The score predicts how likely the baseline controller is to succeed, not how controllable a case is. Discrimination is modest: the area under the receiver-operating characteristic curve is 0.688 overall in the validation atlas, ranges from 0.590 to 0.727 across seed × family cells, and is 0.610 with a Brier score of 0.265 on a fully held-out seed that was used neither for fitting nor for tuning. A score with this discrimination supports a stratified description but not a claim that the bands identify a latent controllability construct, and we make only the weaker claim.</w:t>
       </w:r>
     </w:p>
     <w:p>
       <w:pPr>
+        <w:pStyle w:val="Heading3"/>
         <w:keepNext/>
         <w:spacing w:before="240" w:after="80"/>
         <w:jc w:val="left"/>
@@ -790,7 +799,7 @@
         <w:jc w:val="left"/>
       </w:pPr>
       <w:r>
-        <w:t xml:space="preserve">Six endpoints were defined before the validation outputs were analysed. A trial is </w:t>
+        <w:t xml:space="preserve">Six endpoints were defined before the validation outputs were analysed (Table S1). A trial is </w:t>
       </w:r>
       <w:r>
         <w:rPr>
@@ -799,7 +808,7 @@
         <w:t>warm</w:t>
       </w:r>
       <w:r>
-        <w:t xml:space="preserve"> when the fraction of the protocol window with temperature between 43 C and 50 C is at least 0.50. </w:t>
+        <w:t xml:space="preserve"> when the fraction of the protocol window with temperature between 43 °C and 50 °C is at least 0.50. </w:t>
       </w:r>
       <w:r>
         <w:rPr>
@@ -817,7 +826,7 @@
         <w:t>Hypoxic control</w:t>
       </w:r>
       <w:r>
-        <w:t xml:space="preserve"> is met when the fraction of the window with oxygen below 5 uM and ROS below threshold is at most 0.35. </w:t>
+        <w:t xml:space="preserve"> is met when the fraction of the window with oxygen below 5 µM and ROS below threshold is at most 0.35. </w:t>
       </w:r>
       <w:r>
         <w:rPr>
@@ -826,7 +835,7 @@
         <w:t>Safe heating</w:t>
       </w:r>
       <w:r>
-        <w:t xml:space="preserve"> is met when the fraction of the window above 55 C is at most 0.05 and the maximum temperature is at most 55 C. </w:t>
+        <w:t xml:space="preserve"> is met when the fraction of the window above 55 °C is at most 0.05 and the maximum temperature is at most 55 °C. </w:t>
       </w:r>
       <w:r>
         <w:rPr>
@@ -835,11 +844,12 @@
         <w:t>Success</w:t>
       </w:r>
       <w:r>
-        <w:t xml:space="preserve"> requires all four. Three failure modes are defined as complements of the components: thermal failure is failure to warm while heating safely, ROS failure is failure to reach ROS coverage, and overheating is failure of safe heating. A fourth, hypoxic failure, is the complement of hypoxic control. Delivered energy in J cm^-2 and maximum temperature in C are recorded as continuous outcomes.</w:t>
+        <w:t xml:space="preserve"> requires all four. Three failure modes are defined as complements of the components: thermal failure is failure to warm while heating safely, ROS failure is failure to reach ROS coverage, and overheating is failure of safe heating. A fourth, hypoxic failure, is the complement of hypoxic control. Delivered energy in J cm⁻² and maximum temperature in °C are recorded as continuous outcomes.</w:t>
       </w:r>
     </w:p>
     <w:p>
       <w:pPr>
+        <w:pStyle w:val="Heading3"/>
         <w:keepNext/>
         <w:spacing w:before="240" w:after="80"/>
         <w:jc w:val="left"/>
@@ -859,7 +869,7 @@
         <w:jc w:val="left"/>
       </w:pPr>
       <w:r>
-        <w:t>All inference is paired at the trial level and clustered at the seed x family x draw level. For a binary paired outcome the estimand is the ratio of summed within-cluster differences to the total number of trials, which equals the difference in success proportions. Cluster bootstrap intervals use 10,000 resamples of the 384 clusters, drawn once per controller x stratum cell and shared across endpoints so that intervals for correlated endpoints remain coherent. The primary test is a cluster-level sign-flip randomisation test with 20,000 sign vectors applied to the within-cluster sums; the test statistic is the ratio of summed signed cluster totals to the total trial count, and the p-value is the proportion of permutations whose absolute statistic is at least the observed absolute statistic, with the observed value included in the reference set. This test is exact under the null of exchangeable signs within a pair and requires no distributional assumption. Because the estimand is a ratio of sums rather than a mean of cluster means, the test remains valid when clusters are unbalanced, which they are once the data are stratified.</w:t>
+        <w:t>All inference is paired at the trial level and clustered at the seed × family × draw level. For a binary paired outcome the estimand is the ratio of summed within-cluster differences to the total number of trials, which equals the difference in success proportions. Cluster bootstrap intervals use 10,000 resamples of the 384 clusters, drawn once per controller × stratum cell and shared across endpoints so that intervals for correlated endpoints remain coherent. The primary test is a cluster-level sign-flip randomisation test with 20,000 sign vectors applied to the within-cluster sums; the test statistic is the ratio of summed signed cluster totals to the total trial count, and the p-value is the proportion of permutations whose absolute statistic is at least the observed absolute statistic, with the observed value included in the reference set. This test is exact under the null of exchangeable signs within a pair and requires no distributional assumption. Because the estimand is a ratio of sums rather than a mean of cluster means, the test remains valid when clusters are unbalanced, which they are once the data are stratified.</w:t>
       </w:r>
     </w:p>
     <w:p>
@@ -867,7 +877,7 @@
         <w:jc w:val="left"/>
       </w:pPr>
       <w:r>
-        <w:t>Multiplicity is controlled with Holm's sequentially rejective procedure over a pre-declared family of 12 tests: four controllers x three bands, for the success endpoint (Holm, 1979). A second family of 20 tests covers five mechanism and burden endpoints (thermal failure, ROS failure, hypoxic failure, overheating, delivered energy) across four controllers at the all-trial level. p-values are reported to three decimal places, except that values below 0.001 are reported as such; the minimum attainable permutation p-value with 20,000 permutations is 0.00005.</w:t>
+        <w:t>Multiplicity is controlled with Holm's sequentially rejective procedure over a locked family of 12 tests: four controllers × three bands, for the success endpoint (Holm, 1979). A second family of 20 tests covers five mechanism and burden endpoints (thermal failure, ROS failure, hypoxic failure, overheating, delivered energy) across four controllers at the all-trial level. p-values are reported to three decimal places, except that values below 0.001 are reported as such; the minimum attainable permutation p-value with 20,000 permutations is 0.00005.</w:t>
       </w:r>
     </w:p>
     <w:p>
@@ -880,6 +890,7 @@
     </w:p>
     <w:p>
       <w:pPr>
+        <w:pStyle w:val="Heading3"/>
         <w:keepNext/>
         <w:spacing w:before="240" w:after="80"/>
         <w:jc w:val="left"/>
@@ -904,6 +915,7 @@
     </w:p>
     <w:p>
       <w:pPr>
+        <w:pStyle w:val="Heading3"/>
         <w:keepNext/>
         <w:spacing w:before="240" w:after="80"/>
         <w:jc w:val="left"/>
@@ -936,6 +948,7 @@
     </w:p>
     <w:p>
       <w:pPr>
+        <w:pStyle w:val="Heading3"/>
         <w:keepNext/>
         <w:spacing w:before="240" w:after="80"/>
         <w:jc w:val="left"/>
@@ -960,6 +973,7 @@
     </w:p>
     <w:p>
       <w:pPr>
+        <w:pStyle w:val="Heading3"/>
         <w:keepNext/>
         <w:spacing w:before="240" w:after="80"/>
         <w:jc w:val="left"/>
@@ -984,6 +998,32 @@
     </w:p>
     <w:p>
       <w:pPr>
+        <w:pStyle w:val="Heading3"/>
+        <w:keepNext/>
+        <w:spacing w:before="240" w:after="80"/>
+        <w:jc w:val="left"/>
+      </w:pPr>
+      <w:r>
+        <w:rPr>
+          <w:rFonts w:ascii="Times New Roman" w:hAnsi="Times New Roman"/>
+          <w:b/>
+          <w:i/>
+          <w:sz w:val="24"/>
+        </w:rPr>
+        <w:t>Use of generative AI</w:t>
+      </w:r>
+    </w:p>
+    <w:p>
+      <w:pPr>
+        <w:jc w:val="left"/>
+      </w:pPr>
+      <w:r>
+        <w:t>OpenAI ChatGPT (GPT-5) was used in October 2026 to draft and edit the manuscript text and to help structure the analysis code. It was used to accelerate language editing and code organisation, not to generate, analyse or interpret data. No numerical result in this article originates from the tool: every statistic was produced by executing the analysis code on the committed trial-level data and was checked by the author against the program output. The author confirms the originality and accuracy of the content, has reviewed the tool's terms of use and confirms that this use is consistent with them, and takes full responsibility for the integrity of the article, including the accuracy of all references. Generative AI was not used to create, alter or manipulate any figure, image or research datum; all figures were generated programmatically from the analysis outputs by the committed Python code.</w:t>
+      </w:r>
+    </w:p>
+    <w:p>
+      <w:pPr>
+        <w:pStyle w:val="Heading2"/>
         <w:keepNext/>
         <w:spacing w:before="360" w:after="120"/>
         <w:jc w:val="left"/>
@@ -999,6 +1039,7 @@
     </w:p>
     <w:p>
       <w:pPr>
+        <w:pStyle w:val="Heading3"/>
         <w:keepNext/>
         <w:spacing w:before="240" w:after="80"/>
         <w:jc w:val="left"/>
@@ -1031,6 +1072,7 @@
     </w:p>
     <w:p>
       <w:pPr>
+        <w:pStyle w:val="Heading3"/>
         <w:keepNext/>
         <w:spacing w:before="240" w:after="80"/>
         <w:jc w:val="left"/>
@@ -1050,7 +1092,7 @@
         <w:jc w:val="left"/>
       </w:pPr>
       <w:r>
-        <w:t>The four controllers do not fail in the same way, and the pattern explains why a single success rate is an inadequate summary (Table 2, Fig. 3). Smoothed predictive was the only controller that reduced overheating, by 0.012 (-0.024 to -0.0002; p = 0.050; Holm-adjusted p = 0.050), but it increased thermal failure by 0.038 (0.017 to 0.060; p &lt; 0.001; Holm-adjusted p = 0.003) while reducing ROS failure by 0.023 (-0.036 to -0.013; Holm-adjusted p &lt; 0.001) and saving 23.5 J cm^-2 (-29.5 to -17.5; Holm-adjusted p &lt; 0.001). Constrained optimized increased overheating by 0.020 (0.008 to 0.032; Holm-adjusted p = 0.002) and saved 59.1 J cm^-2 (-63.4 to -54.8; Holm-adjusted p &lt; 0.001), with no detectable change in thermal failure (-0.010, -0.042 to 0.021) or ROS failure (-0.002, -0.012 to 0.009). Thermal-floor predictive reduced thermal failure by 0.037 (-0.068 to -0.006; Holm-adjusted p = 0.042) and ROS failure by 0.017 (-0.028 to -0.007; Holm-adjusted p = 0.004), but increased overheating by 0.095 (0.081 to 0.110; Holm-adjusted p &lt; 0.001) and spent 44.2 J cm^-2 more (36.3 to 52.5; Holm-adjusted p &lt; 0.001). Reduced-order MPC reduced thermal failure by 0.048 (-0.081 to -0.018; Holm-adjusted p = 0.008) and ROS failure by 0.054 (-0.072 to -0.037; Holm-adjusted p &lt; 0.001), but increased overheating by 0.497 (0.471 to 0.523; Holm-adjusted p &lt; 0.001), spent 549.7 J cm^-2 more (521.6 to 578.3; Holm-adjusted p &lt; 0.001), and raised maximum temperature by 15.7 C (14.8 to 16.6). Hypoxic failure did not change for any controller; all four deltas were exactly 0.000 with degenerate intervals, so hypoxia is not the axis along which these controllers differ.</w:t>
+        <w:t>The four controllers do not fail in the same way, and the pattern explains why a single success rate is an inadequate summary (Table 2, Fig. 3). Smoothed predictive was the only controller that reduced overheating, by 0.012 (-0.024 to -0.000; p = 0.050; Holm-adjusted p = 0.050), but it increased thermal failure by 0.038 (0.016 to 0.060; p &lt; 0.001; Holm-adjusted p = 0.003) while reducing ROS failure by 0.023 (-0.036 to -0.013; Holm-adjusted p &lt; 0.001) and saving 23.5 J cm⁻² (-29.5 to -17.5; Holm-adjusted p &lt; 0.001). Constrained optimized increased overheating by 0.020 (0.008 to 0.031; Holm-adjusted p = 0.002) and saved 59.1 J cm⁻² (-63.4 to -54.8; Holm-adjusted p &lt; 0.001), with no detectable change in thermal failure (-0.010, -0.042 to 0.021) or ROS failure (-0.002, -0.012 to 0.009). Thermal-floor predictive reduced thermal failure by 0.037 (-0.067 to -0.006; Holm-adjusted p = 0.042) and ROS failure by 0.017 (-0.028 to -0.007; Holm-adjusted p = 0.004), but increased overheating by 0.095 (0.081 to 0.110; Holm-adjusted p &lt; 0.001) and spent 44.2 J cm⁻² more (36.3 to 52.5; Holm-adjusted p &lt; 0.001). Reduced-order MPC reduced thermal failure by 0.048 (-0.081 to -0.018; Holm-adjusted p = 0.008) and ROS failure by 0.054 (-0.072 to -0.037; Holm-adjusted p &lt; 0.001), but increased overheating by 0.497 (0.471 to 0.523; Holm-adjusted p &lt; 0.001), spent 549.7 J cm⁻² more (521.6 to 578.3; Holm-adjusted p &lt; 0.001), and raised maximum temperature by 15.7 °C (14.8 to 16.6). Hypoxic failure did not change for any controller; all four deltas were exactly 0.000 with degenerate intervals, so hypoxia is not the axis along which these controllers differ.</w:t>
       </w:r>
     </w:p>
     <w:p>
@@ -1063,6 +1105,7 @@
     </w:p>
     <w:p>
       <w:pPr>
+        <w:pStyle w:val="Heading3"/>
         <w:keepNext/>
         <w:spacing w:before="240" w:after="80"/>
         <w:jc w:val="left"/>
@@ -1082,7 +1125,7 @@
         <w:jc w:val="left"/>
       </w:pPr>
       <w:r>
-        <w:t>In the predicted-low band (n = 1,122 pairs, 181 clusters), where the baseline success rate was 0.383, the three plausible controllers all had positive point estimates (Table 3). Smoothed predictive changed success by +0.031 (95% CI -0.012 to 0.075; p = 0.181). Thermal-floor predictive changed success by +0.056 (-0.011 to 0.122; p = 0.126). Constrained optimized changed success by +0.050 (-0.012 to 0.112; p = 0.132). Reduced-order MPC changed success by -0.210 (-0.283 to -0.140; p &lt; 0.001). After Holm adjustment across the 12 controller x band tests, the adjusted p-value was 0.629 for each of the three positive estimates, and below 0.001 for reduced-order MPC. Every confidence interval for the three positive estimates includes zero.</w:t>
+        <w:t>In the predicted-low band (n = 1,122 pairs, 181 clusters), where the baseline success rate was 0.383, the three plausible controllers all had positive point estimates (Table 3). Smoothed predictive changed success by +0.031 (95% CI -0.012 to 0.075; p = 0.181). Thermal-floor predictive changed success by +0.056 (-0.011 to 0.122; p = 0.126). Constrained optimized changed success by +0.050 (-0.012 to 0.112; p = 0.132). Reduced-order MPC changed success by -0.210 (-0.283 to -0.140; p &lt; 0.001). After Holm adjustment across the 12 controller × band tests, the adjusted p-value was 0.629 for each of the three positive estimates, and below 0.001 for reduced-order MPC. Every confidence interval for the three positive estimates includes zero.</w:t>
       </w:r>
     </w:p>
     <w:p>
@@ -1095,6 +1138,7 @@
     </w:p>
     <w:p>
       <w:pPr>
+        <w:pStyle w:val="Heading3"/>
         <w:keepNext/>
         <w:spacing w:before="240" w:after="80"/>
         <w:jc w:val="left"/>
@@ -1127,6 +1171,7 @@
     </w:p>
     <w:p>
       <w:pPr>
+        <w:pStyle w:val="Heading3"/>
         <w:keepNext/>
         <w:spacing w:before="240" w:after="80"/>
         <w:jc w:val="left"/>
@@ -1146,7 +1191,7 @@
         <w:jc w:val="left"/>
       </w:pPr>
       <w:r>
-        <w:t>Over the five objectives, no controller dominated any other and none was dominated, so all four are Pareto optimal (Fig. 5). The dominance matrix is empty. This is not a technicality: it follows directly from the mechanism pattern, because each controller is best on at least one objective and worst on at least one other. Smoothed predictive is best on overheating and competitive on energy. Constrained optimized is best on energy. Thermal-floor predictive is best on thermal failure. Reduced-order MPC is best on ROS failure.</w:t>
+        <w:t>Over the five objectives, no controller dominated any other and none was dominated, so all four are Pareto optimal (Fig. 4). The dominance matrix is empty. This is not a technicality: it follows directly from the mechanism pattern, because each controller is best on at least one objective and worst on at least one other. Smoothed predictive is best on overheating and competitive on energy. Constrained optimized is best on energy. Thermal-floor predictive is best on thermal failure. Reduced-order MPC is best on ROS failure.</w:t>
       </w:r>
     </w:p>
     <w:p>
@@ -1154,11 +1199,12 @@
         <w:jc w:val="left"/>
       </w:pPr>
       <w:r>
-        <w:t>Rank stability under random weights shows how little the Pareto structure constrains a recommendation. Across 200,000 Dirichlet weight draws, thermal-floor predictive ranked first in 38.5% of draws, smoothed predictive in 27.9%, constrained optimized in 22.8%, and reduced-order MPC in 10.7%. Thermal-floor predictive was in the top two in 69.5% of draws. Reduced-order MPC was ranked last in 72.3% of draws. No controller is preferred under a majority of defensible weightings, and the most frequent winner changes with the weighting. A paper that reported only the argmax of one fixed utility would therefore have reported a preference, not a finding.</w:t>
+        <w:t>Rank stability under random weights shows how little the Pareto structure constrains a recommendation (Table S3). Across 200,000 Dirichlet weight draws, thermal-floor predictive ranked first in 38.5% of draws, smoothed predictive in 27.9%, constrained optimized in 22.8%, and reduced-order MPC in 10.7%. Thermal-floor predictive was in the top two in 69.5% of draws. Reduced-order MPC was ranked last in 72.3% of draws. No controller is preferred under a majority of defensible weightings, and the most frequent winner changes with the weighting. A paper that reported only the argmax of one fixed utility would therefore have reported a preference, not a finding.</w:t>
       </w:r>
     </w:p>
     <w:p>
       <w:pPr>
+        <w:pStyle w:val="Heading3"/>
         <w:keepNext/>
         <w:spacing w:before="240" w:after="80"/>
         <w:jc w:val="left"/>
@@ -1178,7 +1224,7 @@
         <w:jc w:val="left"/>
       </w:pPr>
       <w:r>
-        <w:t>The specification curve makes the dependence explicit (Fig. 4). Across the 16 specifications per controller, the point estimate was positive in 37.5% of specifications for constrained optimized (range -0.104 to +0.125), 25% for smoothed predictive (-0.100 to +0.020), 25% for thermal-floor predictive (-0.174 to +0.117), and 0% for reduced-order MPC (-0.617 to -0.281). The primary specification, all seeds and all scenarios with the paired estimator, is a single point in each panel.</w:t>
+        <w:t>The specification curve makes the dependence explicit (Fig. 5). Across the 16 specifications per controller, the point estimate was positive in 37.5% of specifications for constrained optimized (range -0.104 to +0.125), 25% for smoothed predictive (-0.100 to +0.020), 25% for thermal-floor predictive (-0.174 to +0.117), and 0% for reduced-order MPC (-0.617 to -0.281). The primary specification, all seeds and all scenarios with the paired estimator, is a single point in each panel.</w:t>
       </w:r>
     </w:p>
     <w:p>
@@ -1191,6 +1237,7 @@
     </w:p>
     <w:p>
       <w:pPr>
+        <w:pStyle w:val="Heading3"/>
         <w:keepNext/>
         <w:spacing w:before="240" w:after="80"/>
         <w:jc w:val="left"/>
@@ -1210,11 +1257,12 @@
         <w:jc w:val="left"/>
       </w:pPr>
       <w:r>
-        <w:t>The bands are only as good as the score that defines them. Discrimination was 0.688 overall in the validation atlas, ranged from 0.590 to 0.727 across the 12 seed x family cells, and fell to 0.610 on a fully held-out seed with a Brier score of 0.265 (Table S2). Calibration was reasonable in the aggregate but coarse at the band level: observed baseline success was 0.383 in the predicted-low band, 0.477 in the predicted-intermediate band and 0.746 in the predicted-high band, against mean predicted probabilities of 0.398, 0.475 and 0.763 respectively. The ordering is correct and the spread is large, which is why stratification is informative. The overlap between adjacent bands is substantial, which is why a band label should not be read as a case-level prediction.</w:t>
+        <w:t>The bands are only as good as the score that defines them. Discrimination was 0.688 overall in the validation atlas, ranged from 0.590 to 0.727 across the 12 seed × family cells, and fell to 0.610 on a fully held-out seed with a Brier score of 0.265 (Table S2). Calibration was reasonable in the aggregate but coarse at the band level: observed baseline success was 0.383 in the predicted-low band, 0.477 in the predicted-intermediate band and 0.746 in the predicted-high band, against mean predicted probabilities of 0.398, 0.475 and 0.763 respectively. The ordering is correct and the spread is large, which is why stratification is informative. The overlap between adjacent bands is substantial, which is why a band label should not be read as a case-level prediction.</w:t>
       </w:r>
     </w:p>
     <w:p>
       <w:pPr>
+        <w:pStyle w:val="Heading2"/>
         <w:keepNext/>
         <w:spacing w:before="360" w:after="120"/>
         <w:jc w:val="left"/>
@@ -1230,6 +1278,7 @@
     </w:p>
     <w:p>
       <w:pPr>
+        <w:pStyle w:val="Heading3"/>
         <w:keepNext/>
         <w:spacing w:before="240" w:after="80"/>
         <w:jc w:val="left"/>
@@ -1254,6 +1303,7 @@
     </w:p>
     <w:p>
       <w:pPr>
+        <w:pStyle w:val="Heading3"/>
         <w:keepNext/>
         <w:spacing w:before="240" w:after="80"/>
         <w:jc w:val="left"/>
@@ -1273,7 +1323,7 @@
         <w:jc w:val="left"/>
       </w:pPr>
       <w:r>
-        <w:t>The difference between this result and a conventional report is not the data. It is the inferential frame. A conventional analysis would have compared controllers in the nominal scenario, or pooled scenarios without clustering, and would have reported the predicted-low uplift as a positive finding. Each of those steps is individually defensible and collectively misleading. Removing delay and noise removes the conditions the safety gates were built for. Pooling without clustering treats 12 trials from the same draw as independent, which the design effect of 2.6 to 5.5 shows they are not. Reporting one controller x one stratum without correction ignores that twelve such cells were examined. The specification curve quantifies the cumulative effect of these choices: for constrained optimized the estimate ranges from -0.104 to +0.125 across 16 defensible specifications, which is wider than any effect the study could reliably detect.</w:t>
+        <w:t>The difference between this result and a conventional report is not the data. It is the inferential frame. A conventional analysis would have compared controllers in the nominal scenario, or pooled scenarios without clustering, and would have reported the predicted-low uplift as a positive finding. Each of those steps is individually defensible and collectively misleading. Removing delay and noise removes the conditions the safety gates were built for. Pooling without clustering treats 12 trials from the same draw as independent, which the design effect of 2.6 to 5.5 shows they are not. Reporting one controller × one stratum without correction ignores that twelve such cells were examined. The specification curve quantifies the cumulative effect of these choices: for constrained optimized the estimate ranges from -0.104 to +0.125 across 16 defensible specifications, which is wider than any effect the study could reliably detect.</w:t>
       </w:r>
     </w:p>
     <w:p>
@@ -1286,6 +1336,7 @@
     </w:p>
     <w:p>
       <w:pPr>
+        <w:pStyle w:val="Heading3"/>
         <w:keepNext/>
         <w:spacing w:before="240" w:after="80"/>
         <w:jc w:val="left"/>
@@ -1326,6 +1377,7 @@
     </w:p>
     <w:p>
       <w:pPr>
+        <w:pStyle w:val="Heading3"/>
         <w:keepNext/>
         <w:spacing w:before="240" w:after="80"/>
         <w:jc w:val="left"/>
@@ -1345,7 +1397,7 @@
         <w:jc w:val="left"/>
       </w:pPr>
       <w:r>
-        <w:t>Three practices follow directly. First, report the paired difference with a cluster-robust interval, not two marginal success rates. The marginal rates in this atlas differ by less than the clustering-induced uncertainty in several cells. Second, correct for the number of controller x endpoint x stratum cells examined, and state the family in advance. The predicted-low signal here is real as a point estimate and absent as evidence after correction. Third, report the multi-endpoint trade-off and decline to scalarise it. The Pareto analysis shows that every controller is best somewhere; a single utility would have hidden that.</w:t>
+        <w:t>Three practices follow directly. First, report the paired difference with a cluster-robust interval, not two marginal success rates. The marginal rates in this atlas differ by less than the clustering-induced uncertainty in several cells. Second, correct for the number of controller × endpoint × stratum cells examined, and state the family in advance. The predicted-low signal here is real as a point estimate and absent as evidence after correction. Third, report the multi-endpoint trade-off and decline to scalarise it. The Pareto analysis shows that every controller is best somewhere; a single utility would have hidden that.</w:t>
       </w:r>
     </w:p>
     <w:p>
@@ -1358,6 +1410,7 @@
     </w:p>
     <w:p>
       <w:pPr>
+        <w:pStyle w:val="Heading3"/>
         <w:keepNext/>
         <w:spacing w:before="240" w:after="80"/>
         <w:jc w:val="left"/>
@@ -1382,6 +1435,7 @@
     </w:p>
     <w:p>
       <w:pPr>
+        <w:pStyle w:val="Heading3"/>
         <w:keepNext/>
         <w:spacing w:before="240" w:after="80"/>
         <w:jc w:val="left"/>
@@ -1406,6 +1460,7 @@
     </w:p>
     <w:p>
       <w:pPr>
+        <w:pStyle w:val="Heading2"/>
         <w:keepNext/>
         <w:spacing w:before="360" w:after="120"/>
         <w:jc w:val="left"/>
@@ -1429,6 +1484,7 @@
     </w:p>
     <w:p>
       <w:pPr>
+        <w:pStyle w:val="Heading2"/>
         <w:keepNext/>
         <w:spacing w:before="360" w:after="120"/>
         <w:jc w:val="left"/>
@@ -1452,6 +1508,7 @@
     </w:p>
     <w:p>
       <w:pPr>
+        <w:pStyle w:val="Heading2"/>
         <w:keepNext/>
         <w:spacing w:before="360" w:after="120"/>
         <w:jc w:val="left"/>
@@ -2133,6 +2190,7 @@
     </w:p>
     <w:p>
       <w:pPr>
+        <w:pStyle w:val="Heading2"/>
         <w:keepNext/>
         <w:spacing w:before="360" w:after="120"/>
         <w:jc w:val="left"/>
@@ -2148,6 +2206,7 @@
     </w:p>
     <w:p>
       <w:pPr>
+        <w:pStyle w:val="Heading3"/>
         <w:keepNext/>
         <w:spacing w:before="240" w:after="80"/>
         <w:jc w:val="left"/>
@@ -2172,6 +2231,7 @@
     </w:p>
     <w:p>
       <w:pPr>
+        <w:pStyle w:val="Heading3"/>
         <w:keepNext/>
         <w:spacing w:before="240" w:after="80"/>
         <w:jc w:val="left"/>
@@ -2196,6 +2256,7 @@
     </w:p>
     <w:p>
       <w:pPr>
+        <w:pStyle w:val="Heading3"/>
         <w:keepNext/>
         <w:spacing w:before="240" w:after="80"/>
         <w:jc w:val="left"/>
@@ -2220,6 +2281,7 @@
     </w:p>
     <w:p>
       <w:pPr>
+        <w:pStyle w:val="Heading3"/>
         <w:keepNext/>
         <w:spacing w:before="240" w:after="80"/>
         <w:jc w:val="left"/>
@@ -2258,30 +2320,6 @@
       </w:r>
       <w:r>
         <w:t>.</w:t>
-      </w:r>
-    </w:p>
-    <w:p>
-      <w:pPr>
-        <w:keepNext/>
-        <w:spacing w:before="240" w:after="80"/>
-        <w:jc w:val="left"/>
-      </w:pPr>
-      <w:r>
-        <w:rPr>
-          <w:rFonts w:ascii="Times New Roman" w:hAnsi="Times New Roman"/>
-          <w:b/>
-          <w:i/>
-          <w:sz w:val="24"/>
-        </w:rPr>
-        <w:t>AI disclosure</w:t>
-      </w:r>
-    </w:p>
-    <w:p>
-      <w:pPr>
-        <w:jc w:val="left"/>
-      </w:pPr>
-      <w:r>
-        <w:t>A large language model was used to assist with drafting and editing the manuscript text and to help structure the analysis code. All numerical results were generated by executing the analysis code on the committed data, and the author verified every reported statistic against the program output.</w:t>
       </w:r>
     </w:p>
     <w:sectPr>
@@ -2722,15 +2760,17 @@
     <w:pPr>
       <w:keepNext/>
       <w:keepLines/>
-      <w:spacing w:before="480" w:after="0"/>
+      <w:spacing w:before="480" w:after="0" w:line="360" w:lineRule="auto"/>
+      <w:jc w:val="left"/>
       <w:outlineLvl w:val="0"/>
     </w:pPr>
     <w:rPr>
-      <w:rFonts w:asciiTheme="majorHAnsi" w:eastAsiaTheme="majorEastAsia" w:hAnsiTheme="majorHAnsi" w:cstheme="majorBidi"/>
+      <w:rFonts w:ascii="Times New Roman" w:hAnsi="Times New Roman" w:cs="Times New Roman" w:eastAsia="Times New Roman"/>
       <w:b/>
       <w:bCs/>
-      <w:color w:val="365F91" w:themeColor="accent1" w:themeShade="BF"/>
-      <w:sz w:val="28"/>
+      <w:i w:val="0"/>
+      <w:color w:val="000000"/>
+      <w:sz w:val="32"/>
       <w:szCs w:val="28"/>
     </w:rPr>
   </w:style>
@@ -2746,15 +2786,17 @@
     <w:pPr>
       <w:keepNext/>
       <w:keepLines/>
-      <w:spacing w:before="200" w:after="0"/>
+      <w:spacing w:before="200" w:after="0" w:line="360" w:lineRule="auto"/>
+      <w:jc w:val="left"/>
       <w:outlineLvl w:val="1"/>
     </w:pPr>
     <w:rPr>
-      <w:rFonts w:asciiTheme="majorHAnsi" w:eastAsiaTheme="majorEastAsia" w:hAnsiTheme="majorHAnsi" w:cstheme="majorBidi"/>
+      <w:rFonts w:ascii="Times New Roman" w:hAnsi="Times New Roman" w:cs="Times New Roman" w:eastAsia="Times New Roman"/>
       <w:b/>
       <w:bCs/>
-      <w:color w:val="4F81BD" w:themeColor="accent1"/>
-      <w:sz w:val="26"/>
+      <w:i w:val="0"/>
+      <w:color w:val="000000"/>
+      <w:sz w:val="24"/>
       <w:szCs w:val="26"/>
     </w:rPr>
   </w:style>
@@ -2770,14 +2812,17 @@
     <w:pPr>
       <w:keepNext/>
       <w:keepLines/>
-      <w:spacing w:before="200" w:after="0"/>
+      <w:spacing w:before="200" w:after="0" w:line="360" w:lineRule="auto"/>
+      <w:jc w:val="left"/>
       <w:outlineLvl w:val="2"/>
     </w:pPr>
     <w:rPr>
-      <w:rFonts w:asciiTheme="majorHAnsi" w:eastAsiaTheme="majorEastAsia" w:hAnsiTheme="majorHAnsi" w:cstheme="majorBidi"/>
+      <w:rFonts w:ascii="Times New Roman" w:hAnsi="Times New Roman" w:cs="Times New Roman" w:eastAsia="Times New Roman"/>
       <w:b/>
       <w:bCs/>
-      <w:color w:val="4F81BD" w:themeColor="accent1"/>
+      <w:i/>
+      <w:color w:val="000000"/>
+      <w:sz w:val="24"/>
     </w:rPr>
   </w:style>
   <w:style w:type="paragraph" w:styleId="Heading4">

</xml_diff>